<commit_message>
Add Lab1 PDF and update docx
Updated the Lab1 Word document and exported a new PDF version for submission. Removed the temporary lock file created by Word during editing.
</commit_message>
<xml_diff>
--- a/Lab1/MaryamJahangir_241949_FSWD_Lab1.docx
+++ b/Lab1/MaryamJahangir_241949_FSWD_Lab1.docx
@@ -47,7 +47,7 @@
                     <pic:cNvPicPr/>
                   </pic:nvPicPr>
                   <pic:blipFill>
-                    <a:blip r:embed="rId6"/>
+                    <a:blip r:embed="rId7"/>
                     <a:stretch>
                       <a:fillRect/>
                     </a:stretch>
@@ -87,7 +87,7 @@
                     <pic:cNvPicPr/>
                   </pic:nvPicPr>
                   <pic:blipFill>
-                    <a:blip r:embed="rId7"/>
+                    <a:blip r:embed="rId8"/>
                     <a:stretch>
                       <a:fillRect/>
                     </a:stretch>
@@ -128,7 +128,7 @@
                     <pic:cNvPicPr/>
                   </pic:nvPicPr>
                   <pic:blipFill>
-                    <a:blip r:embed="rId8"/>
+                    <a:blip r:embed="rId9"/>
                     <a:stretch>
                       <a:fillRect/>
                     </a:stretch>
@@ -168,7 +168,7 @@
                     <pic:cNvPicPr/>
                   </pic:nvPicPr>
                   <pic:blipFill>
-                    <a:blip r:embed="rId9"/>
+                    <a:blip r:embed="rId10"/>
                     <a:stretch>
                       <a:fillRect/>
                     </a:stretch>
@@ -226,14 +226,11 @@
     </w:p>
     <w:p>
       <w:pPr>
-        <w:jc w:val="center"/>
-        <w:rPr>
-          <w:rFonts w:ascii="Times New Roman" w:hAnsi="Times New Roman" w:cs="Times New Roman"/>
-          <w:b/>
-          <w:bCs/>
-          <w:sz w:val="40"/>
-          <w:szCs w:val="40"/>
-          <w:u w:val="single"/>
+        <w:rPr>
+          <w:rFonts w:ascii="Times New Roman" w:hAnsi="Times New Roman" w:cs="Times New Roman"/>
+          <w:sz w:val="24"/>
+          <w:szCs w:val="24"/>
+          <w:lang w:val="en-PK"/>
         </w:rPr>
       </w:pPr>
       <w:r>
@@ -262,7 +259,7 @@
                     <pic:cNvPicPr/>
                   </pic:nvPicPr>
                   <pic:blipFill>
-                    <a:blip r:embed="rId10"/>
+                    <a:blip r:embed="rId11"/>
                     <a:stretch>
                       <a:fillRect/>
                     </a:stretch>
@@ -307,7 +304,7 @@
                     <pic:cNvPicPr/>
                   </pic:nvPicPr>
                   <pic:blipFill>
-                    <a:blip r:embed="rId11"/>
+                    <a:blip r:embed="rId12"/>
                     <a:stretch>
                       <a:fillRect/>
                     </a:stretch>
@@ -353,7 +350,7 @@
                     <pic:cNvPicPr/>
                   </pic:nvPicPr>
                   <pic:blipFill>
-                    <a:blip r:embed="rId12"/>
+                    <a:blip r:embed="rId13"/>
                     <a:stretch>
                       <a:fillRect/>
                     </a:stretch>
@@ -373,26 +370,529 @@
           </wp:inline>
         </w:drawing>
       </w:r>
+      <w:r>
+        <w:rPr>
+          <w:rFonts w:ascii="Times New Roman" w:hAnsi="Times New Roman" w:cs="Times New Roman"/>
+          <w:sz w:val="24"/>
+          <w:szCs w:val="24"/>
+          <w:lang w:val="en-PK"/>
+        </w:rPr>
+        <w:t xml:space="preserve">  </w:t>
+      </w:r>
     </w:p>
     <w:p>
       <w:pPr>
-        <w:jc w:val="center"/>
+        <w:rPr>
+          <w:rFonts w:ascii="Times New Roman" w:hAnsi="Times New Roman" w:cs="Times New Roman"/>
+          <w:sz w:val="24"/>
+          <w:szCs w:val="24"/>
+          <w:lang w:val="en-PK"/>
+        </w:rPr>
+      </w:pPr>
+    </w:p>
+    <w:p>
+      <w:pPr>
+        <w:rPr>
+          <w:rFonts w:ascii="Times New Roman" w:hAnsi="Times New Roman" w:cs="Times New Roman"/>
+          <w:sz w:val="24"/>
+          <w:szCs w:val="24"/>
+          <w:lang w:val="en-PK"/>
+        </w:rPr>
+      </w:pPr>
+    </w:p>
+    <w:p>
+      <w:pPr>
+        <w:pStyle w:val="ListParagraph"/>
+        <w:numPr>
+          <w:ilvl w:val="0"/>
+          <w:numId w:val="3"/>
+        </w:numPr>
+        <w:rPr>
+          <w:rFonts w:ascii="Times New Roman" w:hAnsi="Times New Roman" w:cs="Times New Roman"/>
+          <w:sz w:val="24"/>
+          <w:szCs w:val="24"/>
+          <w:lang w:val="en-PK"/>
+        </w:rPr>
+      </w:pPr>
+      <w:r>
+        <w:rPr>
+          <w:rFonts w:ascii="Times New Roman" w:hAnsi="Times New Roman" w:cs="Times New Roman"/>
+          <w:sz w:val="24"/>
+          <w:szCs w:val="24"/>
+          <w:lang w:val="en-PK"/>
+        </w:rPr>
+        <w:t>Now my concepts related to the grid system and breaking points are more clear.</w:t>
+      </w:r>
+    </w:p>
+    <w:p>
+      <w:pPr>
+        <w:pStyle w:val="ListParagraph"/>
+        <w:numPr>
+          <w:ilvl w:val="0"/>
+          <w:numId w:val="3"/>
+        </w:numPr>
+        <w:rPr>
+          <w:rFonts w:ascii="Times New Roman" w:hAnsi="Times New Roman" w:cs="Times New Roman"/>
+          <w:sz w:val="24"/>
+          <w:szCs w:val="24"/>
+          <w:lang w:val="en-PK"/>
+        </w:rPr>
+      </w:pPr>
+      <w:r>
         <w:rPr>
           <w:rFonts w:ascii="Times New Roman" w:hAnsi="Times New Roman" w:cs="Times New Roman"/>
           <w:b/>
           <w:bCs/>
-          <w:sz w:val="40"/>
-          <w:szCs w:val="40"/>
-          <w:u w:val="single"/>
-        </w:rPr>
-      </w:pPr>
+          <w:sz w:val="24"/>
+          <w:szCs w:val="24"/>
+          <w:lang w:val="en-PK"/>
+        </w:rPr>
+        <w:t>T</w:t>
+      </w:r>
       <w:r>
         <w:rPr>
           <w:rFonts w:ascii="Times New Roman" w:hAnsi="Times New Roman" w:cs="Times New Roman"/>
           <w:b/>
           <w:bCs/>
-          <w:sz w:val="40"/>
-          <w:szCs w:val="40"/>
+          <w:sz w:val="24"/>
+          <w:szCs w:val="24"/>
+          <w:lang w:val="en-PK"/>
+        </w:rPr>
+        <w:t>hree cards</w:t>
+      </w:r>
+      <w:r>
+        <w:rPr>
+          <w:rFonts w:ascii="Times New Roman" w:hAnsi="Times New Roman" w:cs="Times New Roman"/>
+          <w:sz w:val="24"/>
+          <w:szCs w:val="24"/>
+          <w:lang w:val="en-PK"/>
+        </w:rPr>
+        <w:t xml:space="preserve"> inside a Bootstrap container and row.</w:t>
+      </w:r>
+    </w:p>
+    <w:p>
+      <w:pPr>
+        <w:pStyle w:val="ListParagraph"/>
+        <w:numPr>
+          <w:ilvl w:val="0"/>
+          <w:numId w:val="3"/>
+        </w:numPr>
+        <w:rPr>
+          <w:rFonts w:ascii="Times New Roman" w:hAnsi="Times New Roman" w:cs="Times New Roman"/>
+          <w:sz w:val="24"/>
+          <w:szCs w:val="24"/>
+          <w:lang w:val="en-PK"/>
+        </w:rPr>
+      </w:pPr>
+      <w:r>
+        <w:rPr>
+          <w:rFonts w:ascii="Times New Roman" w:hAnsi="Times New Roman" w:cs="Times New Roman"/>
+          <w:sz w:val="24"/>
+          <w:szCs w:val="24"/>
+          <w:lang w:val="en-PK"/>
+        </w:rPr>
+        <w:t xml:space="preserve">For each card, classes </w:t>
+      </w:r>
+      <w:r>
+        <w:rPr>
+          <w:rFonts w:ascii="Times New Roman" w:hAnsi="Times New Roman" w:cs="Times New Roman"/>
+          <w:b/>
+          <w:bCs/>
+          <w:sz w:val="24"/>
+          <w:szCs w:val="24"/>
+          <w:highlight w:val="yellow"/>
+          <w:lang w:val="en-PK"/>
+        </w:rPr>
+        <w:t>col-4 col-md-6 col-lg-12</w:t>
+      </w:r>
+      <w:r>
+        <w:rPr>
+          <w:rFonts w:ascii="Times New Roman" w:hAnsi="Times New Roman" w:cs="Times New Roman"/>
+          <w:sz w:val="24"/>
+          <w:szCs w:val="24"/>
+          <w:lang w:val="en-PK"/>
+        </w:rPr>
+        <w:t>.</w:t>
+      </w:r>
+    </w:p>
+    <w:p>
+      <w:pPr>
+        <w:pStyle w:val="ListParagraph"/>
+        <w:numPr>
+          <w:ilvl w:val="0"/>
+          <w:numId w:val="3"/>
+        </w:numPr>
+        <w:rPr>
+          <w:rFonts w:ascii="Times New Roman" w:hAnsi="Times New Roman" w:cs="Times New Roman"/>
+          <w:sz w:val="24"/>
+          <w:szCs w:val="24"/>
+          <w:lang w:val="en-PK"/>
+        </w:rPr>
+      </w:pPr>
+      <w:r>
+        <w:rPr>
+          <w:rFonts w:ascii="Times New Roman" w:hAnsi="Times New Roman" w:cs="Times New Roman"/>
+          <w:b/>
+          <w:bCs/>
+          <w:sz w:val="24"/>
+          <w:szCs w:val="24"/>
+          <w:lang w:val="en-PK"/>
+        </w:rPr>
+        <w:t>On small screens:</w:t>
+      </w:r>
+      <w:r>
+        <w:rPr>
+          <w:rFonts w:ascii="Times New Roman" w:hAnsi="Times New Roman" w:cs="Times New Roman"/>
+          <w:sz w:val="24"/>
+          <w:szCs w:val="24"/>
+          <w:lang w:val="en-PK"/>
+        </w:rPr>
+        <w:t xml:space="preserve"> </w:t>
+      </w:r>
+      <w:r>
+        <w:rPr>
+          <w:rFonts w:ascii="Times New Roman" w:hAnsi="Times New Roman" w:cs="Times New Roman"/>
+          <w:sz w:val="24"/>
+          <w:szCs w:val="24"/>
+          <w:highlight w:val="yellow"/>
+          <w:lang w:val="en-PK"/>
+        </w:rPr>
+        <w:t>col-4</w:t>
+      </w:r>
+      <w:r>
+        <w:rPr>
+          <w:rFonts w:ascii="Times New Roman" w:hAnsi="Times New Roman" w:cs="Times New Roman"/>
+          <w:sz w:val="24"/>
+          <w:szCs w:val="24"/>
+          <w:lang w:val="en-PK"/>
+        </w:rPr>
+        <w:t xml:space="preserve"> is applied, so each card takes </w:t>
+      </w:r>
+      <w:r>
+        <w:rPr>
+          <w:rFonts w:ascii="Times New Roman" w:hAnsi="Times New Roman" w:cs="Times New Roman"/>
+          <w:b/>
+          <w:bCs/>
+          <w:sz w:val="24"/>
+          <w:szCs w:val="24"/>
+          <w:lang w:val="en-PK"/>
+        </w:rPr>
+        <w:t>4 out of 12 columns</w:t>
+      </w:r>
+      <w:r>
+        <w:rPr>
+          <w:rFonts w:ascii="Times New Roman" w:hAnsi="Times New Roman" w:cs="Times New Roman"/>
+          <w:sz w:val="24"/>
+          <w:szCs w:val="24"/>
+          <w:lang w:val="en-PK"/>
+        </w:rPr>
+        <w:t>. This means all three cards can fit in the same row because 4 + 4 + 4 = 12.</w:t>
+      </w:r>
+    </w:p>
+    <w:p>
+      <w:pPr>
+        <w:pStyle w:val="ListParagraph"/>
+        <w:numPr>
+          <w:ilvl w:val="0"/>
+          <w:numId w:val="3"/>
+        </w:numPr>
+        <w:rPr>
+          <w:rFonts w:ascii="Times New Roman" w:hAnsi="Times New Roman" w:cs="Times New Roman"/>
+          <w:sz w:val="24"/>
+          <w:szCs w:val="24"/>
+          <w:lang w:val="en-PK"/>
+        </w:rPr>
+      </w:pPr>
+      <w:r>
+        <w:rPr>
+          <w:rFonts w:ascii="Times New Roman" w:hAnsi="Times New Roman" w:cs="Times New Roman"/>
+          <w:b/>
+          <w:bCs/>
+          <w:sz w:val="24"/>
+          <w:szCs w:val="24"/>
+          <w:lang w:val="en-PK"/>
+        </w:rPr>
+        <w:t>On medium screens:</w:t>
+      </w:r>
+      <w:r>
+        <w:rPr>
+          <w:rFonts w:ascii="Times New Roman" w:hAnsi="Times New Roman" w:cs="Times New Roman"/>
+          <w:sz w:val="24"/>
+          <w:szCs w:val="24"/>
+          <w:lang w:val="en-PK"/>
+        </w:rPr>
+        <w:t xml:space="preserve"> </w:t>
+      </w:r>
+      <w:r>
+        <w:rPr>
+          <w:rFonts w:ascii="Times New Roman" w:hAnsi="Times New Roman" w:cs="Times New Roman"/>
+          <w:sz w:val="24"/>
+          <w:szCs w:val="24"/>
+          <w:highlight w:val="yellow"/>
+          <w:lang w:val="en-PK"/>
+        </w:rPr>
+        <w:t>col-md-6</w:t>
+      </w:r>
+      <w:r>
+        <w:rPr>
+          <w:rFonts w:ascii="Times New Roman" w:hAnsi="Times New Roman" w:cs="Times New Roman"/>
+          <w:sz w:val="24"/>
+          <w:szCs w:val="24"/>
+          <w:lang w:val="en-PK"/>
+        </w:rPr>
+        <w:t xml:space="preserve"> is applied, so each card takes </w:t>
+      </w:r>
+      <w:r>
+        <w:rPr>
+          <w:rFonts w:ascii="Times New Roman" w:hAnsi="Times New Roman" w:cs="Times New Roman"/>
+          <w:b/>
+          <w:bCs/>
+          <w:sz w:val="24"/>
+          <w:szCs w:val="24"/>
+          <w:lang w:val="en-PK"/>
+        </w:rPr>
+        <w:t>6 out of 12 columns</w:t>
+      </w:r>
+      <w:r>
+        <w:rPr>
+          <w:rFonts w:ascii="Times New Roman" w:hAnsi="Times New Roman" w:cs="Times New Roman"/>
+          <w:sz w:val="24"/>
+          <w:szCs w:val="24"/>
+          <w:lang w:val="en-PK"/>
+        </w:rPr>
+        <w:t xml:space="preserve">. Therefore, only </w:t>
+      </w:r>
+      <w:r>
+        <w:rPr>
+          <w:rFonts w:ascii="Times New Roman" w:hAnsi="Times New Roman" w:cs="Times New Roman"/>
+          <w:b/>
+          <w:bCs/>
+          <w:sz w:val="24"/>
+          <w:szCs w:val="24"/>
+          <w:lang w:val="en-PK"/>
+        </w:rPr>
+        <w:t>two cards fit in one row</w:t>
+      </w:r>
+      <w:r>
+        <w:rPr>
+          <w:rFonts w:ascii="Times New Roman" w:hAnsi="Times New Roman" w:cs="Times New Roman"/>
+          <w:sz w:val="24"/>
+          <w:szCs w:val="24"/>
+          <w:lang w:val="en-PK"/>
+        </w:rPr>
+        <w:t xml:space="preserve">, </w:t>
+      </w:r>
+      <w:r>
+        <w:rPr>
+          <w:rFonts w:ascii="Times New Roman" w:hAnsi="Times New Roman" w:cs="Times New Roman"/>
+          <w:sz w:val="24"/>
+          <w:szCs w:val="24"/>
+          <w:lang w:val="en-PK"/>
+        </w:rPr>
+        <w:t xml:space="preserve">as 6+6 = 12 </w:t>
+      </w:r>
+      <w:r>
+        <w:rPr>
+          <w:rFonts w:ascii="Times New Roman" w:hAnsi="Times New Roman" w:cs="Times New Roman"/>
+          <w:sz w:val="24"/>
+          <w:szCs w:val="24"/>
+          <w:lang w:val="en-PK"/>
+        </w:rPr>
+        <w:t>and the third card moves to the next row.</w:t>
+      </w:r>
+    </w:p>
+    <w:p>
+      <w:pPr>
+        <w:pStyle w:val="ListParagraph"/>
+        <w:numPr>
+          <w:ilvl w:val="0"/>
+          <w:numId w:val="3"/>
+        </w:numPr>
+        <w:rPr>
+          <w:rFonts w:ascii="Times New Roman" w:hAnsi="Times New Roman" w:cs="Times New Roman"/>
+          <w:sz w:val="24"/>
+          <w:szCs w:val="24"/>
+          <w:lang w:val="en-PK"/>
+        </w:rPr>
+      </w:pPr>
+      <w:r>
+        <w:rPr>
+          <w:rFonts w:ascii="Times New Roman" w:hAnsi="Times New Roman" w:cs="Times New Roman"/>
+          <w:b/>
+          <w:bCs/>
+          <w:sz w:val="24"/>
+          <w:szCs w:val="24"/>
+          <w:lang w:val="en-PK"/>
+        </w:rPr>
+        <w:t>On large screens:</w:t>
+      </w:r>
+      <w:r>
+        <w:rPr>
+          <w:rFonts w:ascii="Times New Roman" w:hAnsi="Times New Roman" w:cs="Times New Roman"/>
+          <w:sz w:val="24"/>
+          <w:szCs w:val="24"/>
+          <w:lang w:val="en-PK"/>
+        </w:rPr>
+        <w:t xml:space="preserve"> </w:t>
+      </w:r>
+      <w:r>
+        <w:rPr>
+          <w:rFonts w:ascii="Times New Roman" w:hAnsi="Times New Roman" w:cs="Times New Roman"/>
+          <w:sz w:val="24"/>
+          <w:szCs w:val="24"/>
+          <w:highlight w:val="yellow"/>
+          <w:lang w:val="en-PK"/>
+        </w:rPr>
+        <w:t>col-lg-12</w:t>
+      </w:r>
+      <w:r>
+        <w:rPr>
+          <w:rFonts w:ascii="Times New Roman" w:hAnsi="Times New Roman" w:cs="Times New Roman"/>
+          <w:sz w:val="24"/>
+          <w:szCs w:val="24"/>
+          <w:lang w:val="en-PK"/>
+        </w:rPr>
+        <w:t xml:space="preserve"> is applied, so each card takes the </w:t>
+      </w:r>
+      <w:r>
+        <w:rPr>
+          <w:rFonts w:ascii="Times New Roman" w:hAnsi="Times New Roman" w:cs="Times New Roman"/>
+          <w:b/>
+          <w:bCs/>
+          <w:sz w:val="24"/>
+          <w:szCs w:val="24"/>
+          <w:lang w:val="en-PK"/>
+        </w:rPr>
+        <w:t>full 12 columns</w:t>
+      </w:r>
+      <w:r>
+        <w:rPr>
+          <w:rFonts w:ascii="Times New Roman" w:hAnsi="Times New Roman" w:cs="Times New Roman"/>
+          <w:sz w:val="24"/>
+          <w:szCs w:val="24"/>
+          <w:lang w:val="en-PK"/>
+        </w:rPr>
+        <w:t xml:space="preserve">. Therefore, all three cards appear </w:t>
+      </w:r>
+      <w:r>
+        <w:rPr>
+          <w:rFonts w:ascii="Times New Roman" w:hAnsi="Times New Roman" w:cs="Times New Roman"/>
+          <w:b/>
+          <w:bCs/>
+          <w:sz w:val="24"/>
+          <w:szCs w:val="24"/>
+          <w:lang w:val="en-PK"/>
+        </w:rPr>
+        <w:t>one below another</w:t>
+      </w:r>
+      <w:r>
+        <w:rPr>
+          <w:rFonts w:ascii="Times New Roman" w:hAnsi="Times New Roman" w:cs="Times New Roman"/>
+          <w:sz w:val="24"/>
+          <w:szCs w:val="24"/>
+          <w:lang w:val="en-PK"/>
+        </w:rPr>
+        <w:t>, with each card taking the full row width.</w:t>
+      </w:r>
+    </w:p>
+    <w:p>
+      <w:pPr>
+        <w:pStyle w:val="ListParagraph"/>
+        <w:numPr>
+          <w:ilvl w:val="0"/>
+          <w:numId w:val="3"/>
+        </w:numPr>
+        <w:rPr>
+          <w:rFonts w:ascii="Times New Roman" w:hAnsi="Times New Roman" w:cs="Times New Roman"/>
+          <w:sz w:val="24"/>
+          <w:szCs w:val="24"/>
+          <w:lang w:val="en-PK"/>
+        </w:rPr>
+      </w:pPr>
+      <w:r>
+        <w:rPr>
+          <w:rFonts w:ascii="Times New Roman" w:hAnsi="Times New Roman" w:cs="Times New Roman"/>
+          <w:sz w:val="24"/>
+          <w:szCs w:val="24"/>
+          <w:lang w:val="en-PK"/>
+        </w:rPr>
+        <w:t xml:space="preserve">Used </w:t>
+      </w:r>
+      <w:r>
+        <w:rPr>
+          <w:rFonts w:ascii="Times New Roman" w:hAnsi="Times New Roman" w:cs="Times New Roman"/>
+          <w:sz w:val="24"/>
+          <w:szCs w:val="24"/>
+          <w:lang w:val="en-PK"/>
+        </w:rPr>
+        <w:t>Bootstrap's predefined card and card-body classes to create the cards without writing custom CSS for their basic structure.</w:t>
+      </w:r>
+    </w:p>
+    <w:p>
+      <w:pPr>
+        <w:pStyle w:val="ListParagraph"/>
+        <w:numPr>
+          <w:ilvl w:val="0"/>
+          <w:numId w:val="3"/>
+        </w:numPr>
+        <w:rPr>
+          <w:rFonts w:ascii="Times New Roman" w:hAnsi="Times New Roman" w:cs="Times New Roman"/>
+          <w:sz w:val="24"/>
+          <w:szCs w:val="24"/>
+          <w:lang w:val="en-PK"/>
+        </w:rPr>
+      </w:pPr>
+      <w:r>
+        <w:rPr>
+          <w:rFonts w:ascii="Times New Roman" w:hAnsi="Times New Roman" w:cs="Times New Roman"/>
+          <w:sz w:val="24"/>
+          <w:szCs w:val="24"/>
+          <w:lang w:val="en-PK"/>
+        </w:rPr>
+        <w:t xml:space="preserve"> bg-light for the light background and py-4 for vertical padding.</w:t>
+      </w:r>
+    </w:p>
+    <w:p>
+      <w:pPr>
+        <w:pStyle w:val="ListParagraph"/>
+        <w:rPr>
+          <w:rFonts w:ascii="Times New Roman" w:hAnsi="Times New Roman" w:cs="Times New Roman"/>
+          <w:sz w:val="24"/>
+          <w:szCs w:val="24"/>
+          <w:lang w:val="en-PK"/>
+        </w:rPr>
+      </w:pPr>
+    </w:p>
+    <w:p>
+      <w:pPr>
+        <w:pStyle w:val="ListParagraph"/>
+        <w:rPr>
+          <w:rFonts w:ascii="Times New Roman" w:hAnsi="Times New Roman" w:cs="Times New Roman"/>
+          <w:sz w:val="24"/>
+          <w:szCs w:val="24"/>
+          <w:lang w:val="en-PK"/>
+        </w:rPr>
+      </w:pPr>
+    </w:p>
+    <w:p>
+      <w:pPr>
+        <w:jc w:val="center"/>
+        <w:rPr>
+          <w:rFonts w:ascii="Times New Roman" w:hAnsi="Times New Roman" w:cs="Times New Roman"/>
+          <w:b/>
+          <w:bCs/>
+          <w:sz w:val="44"/>
+          <w:szCs w:val="44"/>
+          <w:u w:val="single"/>
+        </w:rPr>
+      </w:pPr>
+      <w:r>
+        <w:rPr>
+          <w:rFonts w:ascii="Times New Roman" w:hAnsi="Times New Roman" w:cs="Times New Roman"/>
+          <w:b/>
+          <w:bCs/>
+          <w:sz w:val="44"/>
+          <w:szCs w:val="44"/>
           <w:u w:val="single"/>
         </w:rPr>
         <w:t>HOME TASK</w:t>
@@ -436,7 +936,7 @@
                     <pic:cNvPicPr/>
                   </pic:nvPicPr>
                   <pic:blipFill>
-                    <a:blip r:embed="rId13"/>
+                    <a:blip r:embed="rId14"/>
                     <a:stretch>
                       <a:fillRect/>
                     </a:stretch>
@@ -481,7 +981,7 @@
                     <pic:cNvPicPr/>
                   </pic:nvPicPr>
                   <pic:blipFill>
-                    <a:blip r:embed="rId14"/>
+                    <a:blip r:embed="rId15"/>
                     <a:stretch>
                       <a:fillRect/>
                     </a:stretch>
@@ -538,7 +1038,7 @@
                     <pic:cNvPicPr/>
                   </pic:nvPicPr>
                   <pic:blipFill>
-                    <a:blip r:embed="rId15"/>
+                    <a:blip r:embed="rId16"/>
                     <a:stretch>
                       <a:fillRect/>
                     </a:stretch>
@@ -584,7 +1084,7 @@
                     <pic:cNvPicPr/>
                   </pic:nvPicPr>
                   <pic:blipFill>
-                    <a:blip r:embed="rId16"/>
+                    <a:blip r:embed="rId17"/>
                     <a:stretch>
                       <a:fillRect/>
                     </a:stretch>
@@ -618,7 +1118,459 @@
         </w:rPr>
       </w:pPr>
     </w:p>
-    <w:p/>
+    <w:p>
+      <w:pPr>
+        <w:pStyle w:val="ListParagraph"/>
+        <w:numPr>
+          <w:ilvl w:val="0"/>
+          <w:numId w:val="2"/>
+        </w:numPr>
+        <w:rPr>
+          <w:rFonts w:ascii="Times New Roman" w:hAnsi="Times New Roman" w:cs="Times New Roman"/>
+          <w:sz w:val="24"/>
+          <w:szCs w:val="24"/>
+          <w:lang w:val="en-PK"/>
+        </w:rPr>
+      </w:pPr>
+      <w:r>
+        <w:rPr>
+          <w:rFonts w:ascii="Times New Roman" w:hAnsi="Times New Roman" w:cs="Times New Roman"/>
+          <w:sz w:val="24"/>
+          <w:szCs w:val="24"/>
+          <w:lang w:val="en-PK"/>
+        </w:rPr>
+        <w:t xml:space="preserve">In the navbar, </w:t>
+      </w:r>
+      <w:r>
+        <w:rPr>
+          <w:rFonts w:ascii="Times New Roman" w:hAnsi="Times New Roman" w:cs="Times New Roman"/>
+          <w:sz w:val="24"/>
+          <w:szCs w:val="24"/>
+          <w:lang w:val="en-PK"/>
+        </w:rPr>
+        <w:t xml:space="preserve">I </w:t>
+      </w:r>
+      <w:r>
+        <w:rPr>
+          <w:rFonts w:ascii="Times New Roman" w:hAnsi="Times New Roman" w:cs="Times New Roman"/>
+          <w:sz w:val="24"/>
+          <w:szCs w:val="24"/>
+          <w:lang w:val="en-PK"/>
+        </w:rPr>
+        <w:t xml:space="preserve">used Flexbox with </w:t>
+      </w:r>
+      <w:r>
+        <w:rPr>
+          <w:rFonts w:ascii="Times New Roman" w:hAnsi="Times New Roman" w:cs="Times New Roman"/>
+          <w:sz w:val="24"/>
+          <w:szCs w:val="24"/>
+          <w:highlight w:val="yellow"/>
+          <w:lang w:val="en-PK"/>
+        </w:rPr>
+        <w:t>justify-content: space-between</w:t>
+      </w:r>
+      <w:r>
+        <w:rPr>
+          <w:rFonts w:ascii="Times New Roman" w:hAnsi="Times New Roman" w:cs="Times New Roman"/>
+          <w:sz w:val="24"/>
+          <w:szCs w:val="24"/>
+          <w:lang w:val="en-PK"/>
+        </w:rPr>
+        <w:t xml:space="preserve"> to place the logo on one side and navigation links on the other.</w:t>
+      </w:r>
+    </w:p>
+    <w:p>
+      <w:pPr>
+        <w:pStyle w:val="ListParagraph"/>
+        <w:numPr>
+          <w:ilvl w:val="0"/>
+          <w:numId w:val="2"/>
+        </w:numPr>
+        <w:rPr>
+          <w:rFonts w:ascii="Times New Roman" w:hAnsi="Times New Roman" w:cs="Times New Roman"/>
+          <w:sz w:val="24"/>
+          <w:szCs w:val="24"/>
+          <w:lang w:val="en-PK"/>
+        </w:rPr>
+      </w:pPr>
+      <w:r>
+        <w:rPr>
+          <w:rFonts w:ascii="Times New Roman" w:hAnsi="Times New Roman" w:cs="Times New Roman"/>
+          <w:sz w:val="24"/>
+          <w:szCs w:val="24"/>
+          <w:lang w:val="en-PK"/>
+        </w:rPr>
+        <w:t xml:space="preserve">The hero section uses a purple background with multiple </w:t>
+      </w:r>
+      <w:r>
+        <w:rPr>
+          <w:rFonts w:ascii="Times New Roman" w:hAnsi="Times New Roman" w:cs="Times New Roman"/>
+          <w:sz w:val="24"/>
+          <w:szCs w:val="24"/>
+          <w:highlight w:val="yellow"/>
+          <w:lang w:val="en-PK"/>
+        </w:rPr>
+        <w:t>radial-gradient()</w:t>
+      </w:r>
+      <w:r>
+        <w:rPr>
+          <w:rFonts w:ascii="Times New Roman" w:hAnsi="Times New Roman" w:cs="Times New Roman"/>
+          <w:sz w:val="24"/>
+          <w:szCs w:val="24"/>
+          <w:lang w:val="en-PK"/>
+        </w:rPr>
+        <w:t xml:space="preserve"> effects to create the background design.</w:t>
+      </w:r>
+    </w:p>
+    <w:p>
+      <w:pPr>
+        <w:pStyle w:val="ListParagraph"/>
+        <w:numPr>
+          <w:ilvl w:val="0"/>
+          <w:numId w:val="2"/>
+        </w:numPr>
+        <w:rPr>
+          <w:rFonts w:ascii="Times New Roman" w:hAnsi="Times New Roman" w:cs="Times New Roman"/>
+          <w:sz w:val="24"/>
+          <w:szCs w:val="24"/>
+          <w:lang w:val="en-PK"/>
+        </w:rPr>
+      </w:pPr>
+      <w:r>
+        <w:rPr>
+          <w:rFonts w:ascii="Times New Roman" w:hAnsi="Times New Roman" w:cs="Times New Roman"/>
+          <w:sz w:val="24"/>
+          <w:szCs w:val="24"/>
+          <w:lang w:val="en-PK"/>
+        </w:rPr>
+        <w:t>T</w:t>
+      </w:r>
+      <w:r>
+        <w:rPr>
+          <w:rFonts w:ascii="Times New Roman" w:hAnsi="Times New Roman" w:cs="Times New Roman"/>
+          <w:sz w:val="24"/>
+          <w:szCs w:val="24"/>
+          <w:lang w:val="en-PK"/>
+        </w:rPr>
+        <w:t xml:space="preserve">he search bar using Flexbox, where the input takes the available space using </w:t>
+      </w:r>
+      <w:r>
+        <w:rPr>
+          <w:rFonts w:ascii="Times New Roman" w:hAnsi="Times New Roman" w:cs="Times New Roman"/>
+          <w:sz w:val="24"/>
+          <w:szCs w:val="24"/>
+          <w:highlight w:val="yellow"/>
+          <w:lang w:val="en-PK"/>
+        </w:rPr>
+        <w:t>flex: 1</w:t>
+      </w:r>
+      <w:r>
+        <w:rPr>
+          <w:rFonts w:ascii="Times New Roman" w:hAnsi="Times New Roman" w:cs="Times New Roman"/>
+          <w:sz w:val="24"/>
+          <w:szCs w:val="24"/>
+          <w:lang w:val="en-PK"/>
+        </w:rPr>
+        <w:t>.</w:t>
+      </w:r>
+    </w:p>
+    <w:p>
+      <w:pPr>
+        <w:pStyle w:val="ListParagraph"/>
+        <w:numPr>
+          <w:ilvl w:val="0"/>
+          <w:numId w:val="2"/>
+        </w:numPr>
+        <w:rPr>
+          <w:rFonts w:ascii="Times New Roman" w:hAnsi="Times New Roman" w:cs="Times New Roman"/>
+          <w:sz w:val="24"/>
+          <w:szCs w:val="24"/>
+          <w:lang w:val="en-PK"/>
+        </w:rPr>
+      </w:pPr>
+      <w:r>
+        <w:rPr>
+          <w:rFonts w:ascii="Times New Roman" w:hAnsi="Times New Roman" w:cs="Times New Roman"/>
+          <w:sz w:val="24"/>
+          <w:szCs w:val="24"/>
+          <w:lang w:val="en-PK"/>
+        </w:rPr>
+        <w:t xml:space="preserve">For the Popular Articles section, I created four separate article cards and arranged them using </w:t>
+      </w:r>
+      <w:r>
+        <w:rPr>
+          <w:rFonts w:ascii="Times New Roman" w:hAnsi="Times New Roman" w:cs="Times New Roman"/>
+          <w:sz w:val="24"/>
+          <w:szCs w:val="24"/>
+          <w:highlight w:val="yellow"/>
+          <w:lang w:val="en-PK"/>
+        </w:rPr>
+        <w:t>display: flex,</w:t>
+      </w:r>
+      <w:r>
+        <w:rPr>
+          <w:rFonts w:ascii="Times New Roman" w:hAnsi="Times New Roman" w:cs="Times New Roman"/>
+          <w:sz w:val="24"/>
+          <w:szCs w:val="24"/>
+          <w:lang w:val="en-PK"/>
+        </w:rPr>
+        <w:t xml:space="preserve"> </w:t>
+      </w:r>
+      <w:r>
+        <w:rPr>
+          <w:rFonts w:ascii="Times New Roman" w:hAnsi="Times New Roman" w:cs="Times New Roman"/>
+          <w:sz w:val="24"/>
+          <w:szCs w:val="24"/>
+          <w:highlight w:val="yellow"/>
+          <w:lang w:val="en-PK"/>
+        </w:rPr>
+        <w:t xml:space="preserve">gap, </w:t>
+      </w:r>
+      <w:r>
+        <w:rPr>
+          <w:rFonts w:ascii="Times New Roman" w:hAnsi="Times New Roman" w:cs="Times New Roman"/>
+          <w:sz w:val="24"/>
+          <w:szCs w:val="24"/>
+          <w:lang w:val="en-PK"/>
+        </w:rPr>
+        <w:t xml:space="preserve">and </w:t>
+      </w:r>
+      <w:r>
+        <w:rPr>
+          <w:rFonts w:ascii="Times New Roman" w:hAnsi="Times New Roman" w:cs="Times New Roman"/>
+          <w:sz w:val="24"/>
+          <w:szCs w:val="24"/>
+          <w:highlight w:val="yellow"/>
+          <w:lang w:val="en-PK"/>
+        </w:rPr>
+        <w:t>flex-wrap</w:t>
+      </w:r>
+      <w:r>
+        <w:rPr>
+          <w:rFonts w:ascii="Times New Roman" w:hAnsi="Times New Roman" w:cs="Times New Roman"/>
+          <w:sz w:val="24"/>
+          <w:szCs w:val="24"/>
+          <w:lang w:val="en-PK"/>
+        </w:rPr>
+        <w:t>.</w:t>
+      </w:r>
+    </w:p>
+    <w:p>
+      <w:pPr>
+        <w:pStyle w:val="ListParagraph"/>
+        <w:numPr>
+          <w:ilvl w:val="0"/>
+          <w:numId w:val="2"/>
+        </w:numPr>
+        <w:rPr>
+          <w:rFonts w:ascii="Times New Roman" w:hAnsi="Times New Roman" w:cs="Times New Roman"/>
+          <w:sz w:val="24"/>
+          <w:szCs w:val="24"/>
+          <w:lang w:val="en-PK"/>
+        </w:rPr>
+      </w:pPr>
+      <w:r>
+        <w:rPr>
+          <w:rFonts w:ascii="Times New Roman" w:hAnsi="Times New Roman" w:cs="Times New Roman"/>
+          <w:sz w:val="24"/>
+          <w:szCs w:val="24"/>
+          <w:lang w:val="en-PK"/>
+        </w:rPr>
+        <w:t xml:space="preserve">Each article card has an icon, heading, and helpful count. I used </w:t>
+      </w:r>
+      <w:r>
+        <w:rPr>
+          <w:rFonts w:ascii="Times New Roman" w:hAnsi="Times New Roman" w:cs="Times New Roman"/>
+          <w:sz w:val="24"/>
+          <w:szCs w:val="24"/>
+          <w:highlight w:val="yellow"/>
+          <w:lang w:val="en-PK"/>
+        </w:rPr>
+        <w:t>box-shadow</w:t>
+      </w:r>
+      <w:r>
+        <w:rPr>
+          <w:rFonts w:ascii="Times New Roman" w:hAnsi="Times New Roman" w:cs="Times New Roman"/>
+          <w:sz w:val="24"/>
+          <w:szCs w:val="24"/>
+          <w:lang w:val="en-PK"/>
+        </w:rPr>
+        <w:t xml:space="preserve">, </w:t>
+      </w:r>
+      <w:r>
+        <w:rPr>
+          <w:rFonts w:ascii="Times New Roman" w:hAnsi="Times New Roman" w:cs="Times New Roman"/>
+          <w:sz w:val="24"/>
+          <w:szCs w:val="24"/>
+          <w:highlight w:val="yellow"/>
+          <w:lang w:val="en-PK"/>
+        </w:rPr>
+        <w:t>border-radius</w:t>
+      </w:r>
+      <w:r>
+        <w:rPr>
+          <w:rFonts w:ascii="Times New Roman" w:hAnsi="Times New Roman" w:cs="Times New Roman"/>
+          <w:sz w:val="24"/>
+          <w:szCs w:val="24"/>
+          <w:lang w:val="en-PK"/>
+        </w:rPr>
+        <w:t xml:space="preserve">, and </w:t>
+      </w:r>
+      <w:r>
+        <w:rPr>
+          <w:rFonts w:ascii="Times New Roman" w:hAnsi="Times New Roman" w:cs="Times New Roman"/>
+          <w:sz w:val="24"/>
+          <w:szCs w:val="24"/>
+          <w:highlight w:val="yellow"/>
+          <w:lang w:val="en-PK"/>
+        </w:rPr>
+        <w:t>padding</w:t>
+      </w:r>
+      <w:r>
+        <w:rPr>
+          <w:rFonts w:ascii="Times New Roman" w:hAnsi="Times New Roman" w:cs="Times New Roman"/>
+          <w:sz w:val="24"/>
+          <w:szCs w:val="24"/>
+          <w:lang w:val="en-PK"/>
+        </w:rPr>
+        <w:t xml:space="preserve"> to improve the card design.</w:t>
+      </w:r>
+    </w:p>
+    <w:p>
+      <w:pPr>
+        <w:pStyle w:val="ListParagraph"/>
+        <w:numPr>
+          <w:ilvl w:val="0"/>
+          <w:numId w:val="2"/>
+        </w:numPr>
+        <w:rPr>
+          <w:rFonts w:ascii="Times New Roman" w:hAnsi="Times New Roman" w:cs="Times New Roman"/>
+          <w:sz w:val="24"/>
+          <w:szCs w:val="24"/>
+          <w:lang w:val="en-PK"/>
+        </w:rPr>
+      </w:pPr>
+      <w:r>
+        <w:rPr>
+          <w:rFonts w:ascii="Times New Roman" w:hAnsi="Times New Roman" w:cs="Times New Roman"/>
+          <w:sz w:val="24"/>
+          <w:szCs w:val="24"/>
+          <w:lang w:val="en-PK"/>
+        </w:rPr>
+        <w:t xml:space="preserve">SVG elements for the </w:t>
+      </w:r>
+      <w:r>
+        <w:rPr>
+          <w:rFonts w:ascii="Times New Roman" w:hAnsi="Times New Roman" w:cs="Times New Roman"/>
+          <w:b/>
+          <w:bCs/>
+          <w:sz w:val="24"/>
+          <w:szCs w:val="24"/>
+          <w:lang w:val="en-PK"/>
+        </w:rPr>
+        <w:t>DevDesk logo, search icon, and document icons</w:t>
+      </w:r>
+      <w:r>
+        <w:rPr>
+          <w:rFonts w:ascii="Times New Roman" w:hAnsi="Times New Roman" w:cs="Times New Roman"/>
+          <w:sz w:val="24"/>
+          <w:szCs w:val="24"/>
+          <w:lang w:val="en-PK"/>
+        </w:rPr>
+        <w:t xml:space="preserve"> instead of using image files.</w:t>
+      </w:r>
+    </w:p>
+    <w:p>
+      <w:pPr>
+        <w:pStyle w:val="ListParagraph"/>
+        <w:numPr>
+          <w:ilvl w:val="0"/>
+          <w:numId w:val="2"/>
+        </w:numPr>
+        <w:rPr>
+          <w:rFonts w:ascii="Times New Roman" w:hAnsi="Times New Roman" w:cs="Times New Roman"/>
+          <w:sz w:val="24"/>
+          <w:szCs w:val="24"/>
+          <w:lang w:val="en-PK"/>
+        </w:rPr>
+      </w:pPr>
+      <w:r>
+        <w:rPr>
+          <w:rFonts w:ascii="Times New Roman" w:hAnsi="Times New Roman" w:cs="Times New Roman"/>
+          <w:sz w:val="24"/>
+          <w:szCs w:val="24"/>
+          <w:lang w:val="en-PK"/>
+        </w:rPr>
+        <w:t>The Free Trial button and search button were styled separately using background colors, padding, and border-radius.</w:t>
+      </w:r>
+    </w:p>
+    <w:p>
+      <w:pPr>
+        <w:pStyle w:val="ListParagraph"/>
+        <w:numPr>
+          <w:ilvl w:val="0"/>
+          <w:numId w:val="2"/>
+        </w:numPr>
+        <w:rPr>
+          <w:rFonts w:ascii="Times New Roman" w:hAnsi="Times New Roman" w:cs="Times New Roman"/>
+          <w:sz w:val="24"/>
+          <w:szCs w:val="24"/>
+          <w:lang w:val="en-PK"/>
+        </w:rPr>
+      </w:pPr>
+      <w:r>
+        <w:rPr>
+          <w:rFonts w:ascii="Times New Roman" w:hAnsi="Times New Roman" w:cs="Times New Roman"/>
+          <w:sz w:val="24"/>
+          <w:szCs w:val="24"/>
+          <w:highlight w:val="yellow"/>
+          <w:lang w:val="en-PK"/>
+        </w:rPr>
+        <w:t>max-width</w:t>
+      </w:r>
+      <w:r>
+        <w:rPr>
+          <w:rFonts w:ascii="Times New Roman" w:hAnsi="Times New Roman" w:cs="Times New Roman"/>
+          <w:sz w:val="24"/>
+          <w:szCs w:val="24"/>
+          <w:lang w:val="en-PK"/>
+        </w:rPr>
+        <w:t xml:space="preserve"> and </w:t>
+      </w:r>
+      <w:r>
+        <w:rPr>
+          <w:rFonts w:ascii="Times New Roman" w:hAnsi="Times New Roman" w:cs="Times New Roman"/>
+          <w:sz w:val="24"/>
+          <w:szCs w:val="24"/>
+          <w:highlight w:val="yellow"/>
+          <w:lang w:val="en-PK"/>
+        </w:rPr>
+        <w:t>margin: 0 auto</w:t>
+      </w:r>
+      <w:r>
+        <w:rPr>
+          <w:rFonts w:ascii="Times New Roman" w:hAnsi="Times New Roman" w:cs="Times New Roman"/>
+          <w:sz w:val="24"/>
+          <w:szCs w:val="24"/>
+          <w:lang w:val="en-PK"/>
+        </w:rPr>
+        <w:t xml:space="preserve"> to keep the content centered and prevent it from becoming too wide.</w:t>
+      </w:r>
+    </w:p>
+    <w:p>
+      <w:pPr>
+        <w:pStyle w:val="ListParagraph"/>
+        <w:numPr>
+          <w:ilvl w:val="0"/>
+          <w:numId w:val="2"/>
+        </w:numPr>
+        <w:rPr>
+          <w:rFonts w:ascii="Times New Roman" w:hAnsi="Times New Roman" w:cs="Times New Roman"/>
+          <w:sz w:val="24"/>
+          <w:szCs w:val="24"/>
+        </w:rPr>
+      </w:pPr>
+    </w:p>
     <w:sectPr>
       <w:pgSz w:w="11906" w:h="16838"/>
       <w:pgMar w:top="1440" w:right="1440" w:bottom="1440" w:left="1440" w:header="708" w:footer="708" w:gutter="0"/>
@@ -677,6 +1629,359 @@
     </w:p>
   </w:footnote>
 </w:footnotes>
+</file>
+
+<file path=word/numbering.xml><?xml version="1.0" encoding="utf-8"?>
+<w:numbering xmlns:wpc="http://schemas.microsoft.com/office/word/2010/wordprocessingCanvas" xmlns:cx="http://schemas.microsoft.com/office/drawing/2014/chartex" xmlns:cx1="http://schemas.microsoft.com/office/drawing/2015/9/8/chartex" xmlns:cx2="http://schemas.microsoft.com/office/drawing/2015/10/21/chartex" xmlns:cx3="http://schemas.microsoft.com/office/drawing/2016/5/9/chartex" xmlns:cx4="http://schemas.microsoft.com/office/drawing/2016/5/10/chartex" xmlns:cx5="http://schemas.microsoft.com/office/drawing/2016/5/11/chartex" xmlns:cx6="http://schemas.microsoft.com/office/drawing/2016/5/12/chartex" xmlns:cx7="http://schemas.microsoft.com/office/drawing/2016/5/13/chartex" xmlns:cx8="http://schemas.microsoft.com/office/drawing/2016/5/14/chartex" xmlns:mc="http://schemas.openxmlformats.org/markup-compatibility/2006" xmlns:aink="http://schemas.microsoft.com/office/drawing/2016/ink" xmlns:am3d="http://schemas.microsoft.com/office/drawing/2017/model3d" xmlns:o="urn:schemas-microsoft-com:office:office" xmlns:oel="http://schemas.microsoft.com/office/2019/extlst" xmlns:r="http://schemas.openxmlformats.org/officeDocument/2006/relationships" xmlns:m="http://schemas.openxmlformats.org/officeDocument/2006/math" xmlns:v="urn:schemas-microsoft-com:vml" xmlns:wp14="http://schemas.microsoft.com/office/word/2010/wordprocessingDrawing" xmlns:wp="http://schemas.openxmlformats.org/drawingml/2006/wordprocessingDrawing" xmlns:w10="urn:schemas-microsoft-com:office:word" xmlns:w="http://schemas.openxmlformats.org/wordprocessingml/2006/main" xmlns:w14="http://schemas.microsoft.com/office/word/2010/wordml" xmlns:w15="http://schemas.microsoft.com/office/word/2012/wordml" xmlns:w16cex="http://schemas.microsoft.com/office/word/2018/wordml/cex" xmlns:w16cid="http://schemas.microsoft.com/office/word/2016/wordml/cid" xmlns:w16="http://schemas.microsoft.com/office/word/2018/wordml" xmlns:w16du="http://schemas.microsoft.com/office/word/2023/wordml/word16du" xmlns:w16sdtdh="http://schemas.microsoft.com/office/word/2020/wordml/sdtdatahash" xmlns:w16sdtfl="http://schemas.microsoft.com/office/word/2024/wordml/sdtformatlock" xmlns:w16se="http://schemas.microsoft.com/office/word/2015/wordml/symex" xmlns:wpg="http://schemas.microsoft.com/office/word/2010/wordprocessingGroup" xmlns:wpi="http://schemas.microsoft.com/office/word/2010/wordprocessingInk" xmlns:wne="http://schemas.microsoft.com/office/word/2006/wordml" xmlns:wps="http://schemas.microsoft.com/office/word/2010/wordprocessingShape" mc:Ignorable="w14 w15 w16se w16cid w16 w16cex w16sdtdh w16sdtfl w16du wp14">
+  <w:abstractNum w:abstractNumId="0" w15:restartNumberingAfterBreak="0">
+    <w:nsid w:val="08C115C3"/>
+    <w:multiLevelType w:val="hybridMultilevel"/>
+    <w:tmpl w:val="F7368F0A"/>
+    <w:lvl w:ilvl="0" w:tplc="20000001">
+      <w:start w:val="1"/>
+      <w:numFmt w:val="bullet"/>
+      <w:lvlText w:val=""/>
+      <w:lvlJc w:val="left"/>
+      <w:pPr>
+        <w:ind w:left="720" w:hanging="360"/>
+      </w:pPr>
+      <w:rPr>
+        <w:rFonts w:ascii="Symbol" w:hAnsi="Symbol" w:hint="default"/>
+      </w:rPr>
+    </w:lvl>
+    <w:lvl w:ilvl="1" w:tplc="20000003" w:tentative="1">
+      <w:start w:val="1"/>
+      <w:numFmt w:val="bullet"/>
+      <w:lvlText w:val="o"/>
+      <w:lvlJc w:val="left"/>
+      <w:pPr>
+        <w:ind w:left="1440" w:hanging="360"/>
+      </w:pPr>
+      <w:rPr>
+        <w:rFonts w:ascii="Courier New" w:hAnsi="Courier New" w:cs="Courier New" w:hint="default"/>
+      </w:rPr>
+    </w:lvl>
+    <w:lvl w:ilvl="2" w:tplc="20000005" w:tentative="1">
+      <w:start w:val="1"/>
+      <w:numFmt w:val="bullet"/>
+      <w:lvlText w:val=""/>
+      <w:lvlJc w:val="left"/>
+      <w:pPr>
+        <w:ind w:left="2160" w:hanging="360"/>
+      </w:pPr>
+      <w:rPr>
+        <w:rFonts w:ascii="Wingdings" w:hAnsi="Wingdings" w:hint="default"/>
+      </w:rPr>
+    </w:lvl>
+    <w:lvl w:ilvl="3" w:tplc="20000001" w:tentative="1">
+      <w:start w:val="1"/>
+      <w:numFmt w:val="bullet"/>
+      <w:lvlText w:val=""/>
+      <w:lvlJc w:val="left"/>
+      <w:pPr>
+        <w:ind w:left="2880" w:hanging="360"/>
+      </w:pPr>
+      <w:rPr>
+        <w:rFonts w:ascii="Symbol" w:hAnsi="Symbol" w:hint="default"/>
+      </w:rPr>
+    </w:lvl>
+    <w:lvl w:ilvl="4" w:tplc="20000003" w:tentative="1">
+      <w:start w:val="1"/>
+      <w:numFmt w:val="bullet"/>
+      <w:lvlText w:val="o"/>
+      <w:lvlJc w:val="left"/>
+      <w:pPr>
+        <w:ind w:left="3600" w:hanging="360"/>
+      </w:pPr>
+      <w:rPr>
+        <w:rFonts w:ascii="Courier New" w:hAnsi="Courier New" w:cs="Courier New" w:hint="default"/>
+      </w:rPr>
+    </w:lvl>
+    <w:lvl w:ilvl="5" w:tplc="20000005" w:tentative="1">
+      <w:start w:val="1"/>
+      <w:numFmt w:val="bullet"/>
+      <w:lvlText w:val=""/>
+      <w:lvlJc w:val="left"/>
+      <w:pPr>
+        <w:ind w:left="4320" w:hanging="360"/>
+      </w:pPr>
+      <w:rPr>
+        <w:rFonts w:ascii="Wingdings" w:hAnsi="Wingdings" w:hint="default"/>
+      </w:rPr>
+    </w:lvl>
+    <w:lvl w:ilvl="6" w:tplc="20000001" w:tentative="1">
+      <w:start w:val="1"/>
+      <w:numFmt w:val="bullet"/>
+      <w:lvlText w:val=""/>
+      <w:lvlJc w:val="left"/>
+      <w:pPr>
+        <w:ind w:left="5040" w:hanging="360"/>
+      </w:pPr>
+      <w:rPr>
+        <w:rFonts w:ascii="Symbol" w:hAnsi="Symbol" w:hint="default"/>
+      </w:rPr>
+    </w:lvl>
+    <w:lvl w:ilvl="7" w:tplc="20000003" w:tentative="1">
+      <w:start w:val="1"/>
+      <w:numFmt w:val="bullet"/>
+      <w:lvlText w:val="o"/>
+      <w:lvlJc w:val="left"/>
+      <w:pPr>
+        <w:ind w:left="5760" w:hanging="360"/>
+      </w:pPr>
+      <w:rPr>
+        <w:rFonts w:ascii="Courier New" w:hAnsi="Courier New" w:cs="Courier New" w:hint="default"/>
+      </w:rPr>
+    </w:lvl>
+    <w:lvl w:ilvl="8" w:tplc="20000005" w:tentative="1">
+      <w:start w:val="1"/>
+      <w:numFmt w:val="bullet"/>
+      <w:lvlText w:val=""/>
+      <w:lvlJc w:val="left"/>
+      <w:pPr>
+        <w:ind w:left="6480" w:hanging="360"/>
+      </w:pPr>
+      <w:rPr>
+        <w:rFonts w:ascii="Wingdings" w:hAnsi="Wingdings" w:hint="default"/>
+      </w:rPr>
+    </w:lvl>
+  </w:abstractNum>
+  <w:abstractNum w:abstractNumId="1" w15:restartNumberingAfterBreak="0">
+    <w:nsid w:val="1FDC66B7"/>
+    <w:multiLevelType w:val="hybridMultilevel"/>
+    <w:tmpl w:val="A0E04532"/>
+    <w:lvl w:ilvl="0" w:tplc="20000001">
+      <w:start w:val="1"/>
+      <w:numFmt w:val="bullet"/>
+      <w:lvlText w:val=""/>
+      <w:lvlJc w:val="left"/>
+      <w:pPr>
+        <w:ind w:left="720" w:hanging="360"/>
+      </w:pPr>
+      <w:rPr>
+        <w:rFonts w:ascii="Symbol" w:hAnsi="Symbol" w:hint="default"/>
+      </w:rPr>
+    </w:lvl>
+    <w:lvl w:ilvl="1" w:tplc="20000003" w:tentative="1">
+      <w:start w:val="1"/>
+      <w:numFmt w:val="bullet"/>
+      <w:lvlText w:val="o"/>
+      <w:lvlJc w:val="left"/>
+      <w:pPr>
+        <w:ind w:left="1440" w:hanging="360"/>
+      </w:pPr>
+      <w:rPr>
+        <w:rFonts w:ascii="Courier New" w:hAnsi="Courier New" w:cs="Courier New" w:hint="default"/>
+      </w:rPr>
+    </w:lvl>
+    <w:lvl w:ilvl="2" w:tplc="20000005" w:tentative="1">
+      <w:start w:val="1"/>
+      <w:numFmt w:val="bullet"/>
+      <w:lvlText w:val=""/>
+      <w:lvlJc w:val="left"/>
+      <w:pPr>
+        <w:ind w:left="2160" w:hanging="360"/>
+      </w:pPr>
+      <w:rPr>
+        <w:rFonts w:ascii="Wingdings" w:hAnsi="Wingdings" w:hint="default"/>
+      </w:rPr>
+    </w:lvl>
+    <w:lvl w:ilvl="3" w:tplc="20000001" w:tentative="1">
+      <w:start w:val="1"/>
+      <w:numFmt w:val="bullet"/>
+      <w:lvlText w:val=""/>
+      <w:lvlJc w:val="left"/>
+      <w:pPr>
+        <w:ind w:left="2880" w:hanging="360"/>
+      </w:pPr>
+      <w:rPr>
+        <w:rFonts w:ascii="Symbol" w:hAnsi="Symbol" w:hint="default"/>
+      </w:rPr>
+    </w:lvl>
+    <w:lvl w:ilvl="4" w:tplc="20000003" w:tentative="1">
+      <w:start w:val="1"/>
+      <w:numFmt w:val="bullet"/>
+      <w:lvlText w:val="o"/>
+      <w:lvlJc w:val="left"/>
+      <w:pPr>
+        <w:ind w:left="3600" w:hanging="360"/>
+      </w:pPr>
+      <w:rPr>
+        <w:rFonts w:ascii="Courier New" w:hAnsi="Courier New" w:cs="Courier New" w:hint="default"/>
+      </w:rPr>
+    </w:lvl>
+    <w:lvl w:ilvl="5" w:tplc="20000005" w:tentative="1">
+      <w:start w:val="1"/>
+      <w:numFmt w:val="bullet"/>
+      <w:lvlText w:val=""/>
+      <w:lvlJc w:val="left"/>
+      <w:pPr>
+        <w:ind w:left="4320" w:hanging="360"/>
+      </w:pPr>
+      <w:rPr>
+        <w:rFonts w:ascii="Wingdings" w:hAnsi="Wingdings" w:hint="default"/>
+      </w:rPr>
+    </w:lvl>
+    <w:lvl w:ilvl="6" w:tplc="20000001" w:tentative="1">
+      <w:start w:val="1"/>
+      <w:numFmt w:val="bullet"/>
+      <w:lvlText w:val=""/>
+      <w:lvlJc w:val="left"/>
+      <w:pPr>
+        <w:ind w:left="5040" w:hanging="360"/>
+      </w:pPr>
+      <w:rPr>
+        <w:rFonts w:ascii="Symbol" w:hAnsi="Symbol" w:hint="default"/>
+      </w:rPr>
+    </w:lvl>
+    <w:lvl w:ilvl="7" w:tplc="20000003" w:tentative="1">
+      <w:start w:val="1"/>
+      <w:numFmt w:val="bullet"/>
+      <w:lvlText w:val="o"/>
+      <w:lvlJc w:val="left"/>
+      <w:pPr>
+        <w:ind w:left="5760" w:hanging="360"/>
+      </w:pPr>
+      <w:rPr>
+        <w:rFonts w:ascii="Courier New" w:hAnsi="Courier New" w:cs="Courier New" w:hint="default"/>
+      </w:rPr>
+    </w:lvl>
+    <w:lvl w:ilvl="8" w:tplc="20000005" w:tentative="1">
+      <w:start w:val="1"/>
+      <w:numFmt w:val="bullet"/>
+      <w:lvlText w:val=""/>
+      <w:lvlJc w:val="left"/>
+      <w:pPr>
+        <w:ind w:left="6480" w:hanging="360"/>
+      </w:pPr>
+      <w:rPr>
+        <w:rFonts w:ascii="Wingdings" w:hAnsi="Wingdings" w:hint="default"/>
+      </w:rPr>
+    </w:lvl>
+  </w:abstractNum>
+  <w:abstractNum w:abstractNumId="2" w15:restartNumberingAfterBreak="0">
+    <w:nsid w:val="47EE373D"/>
+    <w:multiLevelType w:val="hybridMultilevel"/>
+    <w:tmpl w:val="D3FC05F4"/>
+    <w:lvl w:ilvl="0" w:tplc="20000001">
+      <w:start w:val="1"/>
+      <w:numFmt w:val="bullet"/>
+      <w:lvlText w:val=""/>
+      <w:lvlJc w:val="left"/>
+      <w:pPr>
+        <w:ind w:left="720" w:hanging="360"/>
+      </w:pPr>
+      <w:rPr>
+        <w:rFonts w:ascii="Symbol" w:hAnsi="Symbol" w:hint="default"/>
+      </w:rPr>
+    </w:lvl>
+    <w:lvl w:ilvl="1" w:tplc="20000003" w:tentative="1">
+      <w:start w:val="1"/>
+      <w:numFmt w:val="bullet"/>
+      <w:lvlText w:val="o"/>
+      <w:lvlJc w:val="left"/>
+      <w:pPr>
+        <w:ind w:left="1440" w:hanging="360"/>
+      </w:pPr>
+      <w:rPr>
+        <w:rFonts w:ascii="Courier New" w:hAnsi="Courier New" w:cs="Courier New" w:hint="default"/>
+      </w:rPr>
+    </w:lvl>
+    <w:lvl w:ilvl="2" w:tplc="20000005" w:tentative="1">
+      <w:start w:val="1"/>
+      <w:numFmt w:val="bullet"/>
+      <w:lvlText w:val=""/>
+      <w:lvlJc w:val="left"/>
+      <w:pPr>
+        <w:ind w:left="2160" w:hanging="360"/>
+      </w:pPr>
+      <w:rPr>
+        <w:rFonts w:ascii="Wingdings" w:hAnsi="Wingdings" w:hint="default"/>
+      </w:rPr>
+    </w:lvl>
+    <w:lvl w:ilvl="3" w:tplc="20000001" w:tentative="1">
+      <w:start w:val="1"/>
+      <w:numFmt w:val="bullet"/>
+      <w:lvlText w:val=""/>
+      <w:lvlJc w:val="left"/>
+      <w:pPr>
+        <w:ind w:left="2880" w:hanging="360"/>
+      </w:pPr>
+      <w:rPr>
+        <w:rFonts w:ascii="Symbol" w:hAnsi="Symbol" w:hint="default"/>
+      </w:rPr>
+    </w:lvl>
+    <w:lvl w:ilvl="4" w:tplc="20000003" w:tentative="1">
+      <w:start w:val="1"/>
+      <w:numFmt w:val="bullet"/>
+      <w:lvlText w:val="o"/>
+      <w:lvlJc w:val="left"/>
+      <w:pPr>
+        <w:ind w:left="3600" w:hanging="360"/>
+      </w:pPr>
+      <w:rPr>
+        <w:rFonts w:ascii="Courier New" w:hAnsi="Courier New" w:cs="Courier New" w:hint="default"/>
+      </w:rPr>
+    </w:lvl>
+    <w:lvl w:ilvl="5" w:tplc="20000005" w:tentative="1">
+      <w:start w:val="1"/>
+      <w:numFmt w:val="bullet"/>
+      <w:lvlText w:val=""/>
+      <w:lvlJc w:val="left"/>
+      <w:pPr>
+        <w:ind w:left="4320" w:hanging="360"/>
+      </w:pPr>
+      <w:rPr>
+        <w:rFonts w:ascii="Wingdings" w:hAnsi="Wingdings" w:hint="default"/>
+      </w:rPr>
+    </w:lvl>
+    <w:lvl w:ilvl="6" w:tplc="20000001" w:tentative="1">
+      <w:start w:val="1"/>
+      <w:numFmt w:val="bullet"/>
+      <w:lvlText w:val=""/>
+      <w:lvlJc w:val="left"/>
+      <w:pPr>
+        <w:ind w:left="5040" w:hanging="360"/>
+      </w:pPr>
+      <w:rPr>
+        <w:rFonts w:ascii="Symbol" w:hAnsi="Symbol" w:hint="default"/>
+      </w:rPr>
+    </w:lvl>
+    <w:lvl w:ilvl="7" w:tplc="20000003" w:tentative="1">
+      <w:start w:val="1"/>
+      <w:numFmt w:val="bullet"/>
+      <w:lvlText w:val="o"/>
+      <w:lvlJc w:val="left"/>
+      <w:pPr>
+        <w:ind w:left="5760" w:hanging="360"/>
+      </w:pPr>
+      <w:rPr>
+        <w:rFonts w:ascii="Courier New" w:hAnsi="Courier New" w:cs="Courier New" w:hint="default"/>
+      </w:rPr>
+    </w:lvl>
+    <w:lvl w:ilvl="8" w:tplc="20000005" w:tentative="1">
+      <w:start w:val="1"/>
+      <w:numFmt w:val="bullet"/>
+      <w:lvlText w:val=""/>
+      <w:lvlJc w:val="left"/>
+      <w:pPr>
+        <w:ind w:left="6480" w:hanging="360"/>
+      </w:pPr>
+      <w:rPr>
+        <w:rFonts w:ascii="Wingdings" w:hAnsi="Wingdings" w:hint="default"/>
+      </w:rPr>
+    </w:lvl>
+  </w:abstractNum>
+  <w:num w:numId="1" w16cid:durableId="1184131520">
+    <w:abstractNumId w:val="2"/>
+  </w:num>
+  <w:num w:numId="2" w16cid:durableId="588078272">
+    <w:abstractNumId w:val="0"/>
+  </w:num>
+  <w:num w:numId="3" w16cid:durableId="1945962716">
+    <w:abstractNumId w:val="1"/>
+  </w:num>
+</w:numbering>
 </file>
 
 <file path=word/styles.xml><?xml version="1.0" encoding="utf-8"?>
@@ -1282,7 +2587,6 @@
   <w:style w:type="character" w:default="1" w:styleId="DefaultParagraphFont">
     <w:name w:val="Default Paragraph Font"/>
     <w:uiPriority w:val="1"/>
-    <w:semiHidden/>
     <w:unhideWhenUsed/>
   </w:style>
   <w:style w:type="table" w:default="1" w:styleId="TableNormal">

</xml_diff>